<commit_message>
docs(HU-IMP-DOC-01): ajustes del líder sobre la corrección de la v1.5
- Registro de incidencias y §11.4: INC-FE-04 (doble Cache-Control en
  sw.js), INC-BE-07 (compose de PROD sin guarda :? en MQTT_BROKER_URL y
  MQTT_BROKER_TOKEN) e INC-IMP-05 (compose/ todavía pasa API_TOKEN);
  INC-BE-05 resuelta.
- VARIABLES-ENTORNO.md: AUDITORIA_M02_EVENTOS_POR_SEGUNDO y
  ALEMBIC_DATABASE_URL.
- Documento: institución en la portada, sin leyendas de diagramas sin
  imagen fuente (el mapa de AMB-09 pasa a ser el Diagrama 1) y
  VITE_FIREBASE_API_KEY de TEST como valor propio de TEST. Word regenerado
  con md2docx.
- Fuente de la v1.1 movida a archivo/ecosistema-inicial-2026-08-10/.
- historias/README.md: DOC-01 en revisión (REV-03 pendiente).
</commit_message>
<xml_diff>
--- a/historias/HU-IMP-DOC-01_documento-ambiente-trabajo/entregables/AMBIENTE-DE-TRABAJO-IMPLEMENTACION.docx
+++ b/historias/HU-IMP-DOC-01_documento-ambiente-trabajo/entregables/AMBIENTE-DE-TRABAJO-IMPLEMENTACION.docx
@@ -54,7 +54,7 @@
         <w:rPr>
           <w:lang w:val="es-CO"/>
         </w:rPr>
-        <w:t xml:space="preserve">Octubre de 2026</w:t>
+        <w:t xml:space="preserve">Universidad Surcolombiana · Facultad de Ingeniería · Octubre de 2026</w:t>
       </w:r>
     </w:p>
     <w:sdt>
@@ -1688,7 +1688,7 @@
               <w:rPr>
                 <w:lang w:val="es-CO"/>
               </w:rPr>
-              <w:t xml:space="preserve">Mapa de puertos y protocolos v1.5 (Diagrama 3)</w:t>
+              <w:t xml:space="preserve">Mapa de puertos y protocolos v1.5 (Diagrama 1)</w:t>
             </w:r>
           </w:p>
         </w:tc>
@@ -9593,7 +9593,57 @@
         <w:rPr>
           <w:lang w:val="es-CO"/>
         </w:rPr>
-        <w:t xml:space="preserve">. Pendiente de comprobar con</w:t>
+        <w:t xml:space="preserve">, de modo que</w:t>
+      </w:r>
+      <w:r>
+        <w:rPr>
+          <w:lang w:val="es-CO"/>
+        </w:rPr>
+        <w:t xml:space="preserve"> </w:t>
+      </w:r>
+      <w:r>
+        <w:rPr>
+          <w:rStyle w:val="VerbatimChar"/>
+          <w:lang w:val="es-CO"/>
+        </w:rPr>
+        <w:t xml:space="preserve">sw.js</w:t>
+      </w:r>
+      <w:r>
+        <w:rPr>
+          <w:lang w:val="es-CO"/>
+        </w:rPr>
+        <w:t xml:space="preserve"> </w:t>
+      </w:r>
+      <w:r>
+        <w:rPr>
+          <w:lang w:val="es-CO"/>
+        </w:rPr>
+        <w:t xml:space="preserve">también recibe dos</w:t>
+      </w:r>
+      <w:r>
+        <w:rPr>
+          <w:lang w:val="es-CO"/>
+        </w:rPr>
+        <w:t xml:space="preserve"> </w:t>
+      </w:r>
+      <w:r>
+        <w:rPr>
+          <w:rStyle w:val="VerbatimChar"/>
+          <w:lang w:val="es-CO"/>
+        </w:rPr>
+        <w:t xml:space="preserve">Cache-Control</w:t>
+      </w:r>
+      <w:r>
+        <w:rPr>
+          <w:lang w:val="es-CO"/>
+        </w:rPr>
+        <w:t xml:space="preserve"> </w:t>
+      </w:r>
+      <w:r>
+        <w:rPr>
+          <w:lang w:val="es-CO"/>
+        </w:rPr>
+        <w:t xml:space="preserve">(INC-FE-04, relacionada con HU-IMP-SEG-02). Pendiente de comprobar con</w:t>
       </w:r>
       <w:r>
         <w:rPr>
@@ -10679,57 +10729,6 @@
           <w:lang w:val="es-CO"/>
         </w:rPr>
         <w:t xml:space="preserve">de BE dev@bd8b6d4f, test@81487428 y main@8a7e6327. Ningún workflow publica imágenes (INC-IMP-03).</w:t>
-      </w:r>
-    </w:p>
-    <w:p>
-      <w:pPr>
-        <w:pStyle w:val="BodyText"/>
-      </w:pPr>
-      <w:r>
-        <w:rPr>
-          <w:i/>
-          <w:iCs/>
-          <w:lang w:val="es-CO"/>
-        </w:rPr>
-        <w:t xml:space="preserve">Diagrama 1. Relación entre los Dockerfiles, las imágenes, el compose base, sus archivos por entorno y los tres entornos de ejecución.</w:t>
-      </w:r>
-    </w:p>
-    <w:p>
-      <w:pPr>
-        <w:pStyle w:val="BodyText"/>
-      </w:pPr>
-      <w:r>
-        <w:rPr>
-          <w:b/>
-          <w:bCs/>
-          <w:lang w:val="es-CO"/>
-        </w:rPr>
-        <w:t xml:space="preserve">[PENDIENTE: Diagrama 1 sin imagen fuente.** La v1.4 lo atribuía a</w:t>
-      </w:r>
-      <w:r>
-        <w:rPr>
-          <w:b/>
-          <w:bCs/>
-          <w:lang w:val="es-CO"/>
-        </w:rPr>
-        <w:t xml:space="preserve"> </w:t>
-      </w:r>
-      <w:r>
-        <w:rPr>
-          <w:rStyle w:val="VerbatimChar"/>
-          <w:b/>
-          <w:bCs/>
-          <w:lang w:val="es-CO"/>
-        </w:rPr>
-        <w:t xml:space="preserve">SGPMP_IMPL_Proceso_Ejecucion.drawio</w:t>
-      </w:r>
-      <w:r>
-        <w:rPr>
-          <w:b/>
-          <w:bCs/>
-          <w:lang w:val="es-CO"/>
-        </w:rPr>
-        <w:t xml:space="preserve">, página 4, que no existe en SGMP-Integracion@895d81c. Revisión manual del líder: incluir la imagen desde su fuente o retirar el diagrama.**]</w:t>
       </w:r>
     </w:p>
     <w:p>
@@ -15090,7 +15089,7 @@
               <w:rPr>
                 <w:lang w:val="es-CO"/>
               </w:rPr>
-              <w:t xml:space="preserve">Ídem DEV o proyecto propio de TEST [PENDIENTE: confirmar con Desarrollo]</w:t>
+              <w:t xml:space="preserve">Valor propio de TEST (público por diseño, ver Grupo D)</w:t>
             </w:r>
           </w:p>
         </w:tc>
@@ -19827,7 +19826,7 @@
           <wp:inline>
             <wp:extent cx="5943600" cy="4026309"/>
             <wp:effectExtent b="0" l="0" r="0" t="0"/>
-            <wp:docPr descr="Diagrama 3. Mapa de despliegue, puertos y protocolos v1.5 (HU-IMP-AMB-09)." title="" id="42" name="Picture"/>
+            <wp:docPr descr="Diagrama 1. Mapa de despliegue, puertos y protocolos v1.5 (HU-IMP-AMB-09)." title="" id="42" name="Picture"/>
             <a:graphic>
               <a:graphicData uri="http://schemas.openxmlformats.org/drawingml/2006/picture">
                 <pic:pic>
@@ -19873,7 +19872,7 @@
         <w:rPr>
           <w:lang w:val="es-CO"/>
         </w:rPr>
-        <w:t xml:space="preserve">Diagrama 3. Mapa de despliegue, puertos y protocolos v1.5 (HU-IMP-AMB-09).</w:t>
+        <w:t xml:space="preserve">Diagrama 1. Mapa de despliegue, puertos y protocolos v1.5 (HU-IMP-AMB-09).</w:t>
       </w:r>
     </w:p>
     <w:p>
@@ -19886,7 +19885,7 @@
           <w:iCs/>
           <w:lang w:val="es-CO"/>
         </w:rPr>
-        <w:t xml:space="preserve">Diagrama 3. Mapa de despliegue, puertos y protocolos v1.5. Fuente:</w:t>
+        <w:t xml:space="preserve">Diagrama 1. Mapa de despliegue, puertos y protocolos v1.5. Fuente:</w:t>
       </w:r>
       <w:r>
         <w:rPr>
@@ -26463,49 +26462,6 @@
     </w:p>
     <w:p>
       <w:pPr>
-        <w:pStyle w:val="BodyText"/>
-      </w:pPr>
-      <w:r>
-        <w:rPr>
-          <w:i/>
-          <w:iCs/>
-          <w:lang w:val="es-CO"/>
-        </w:rPr>
-        <w:t xml:space="preserve">Diagrama 2. Punto de integración entre Implementación y AIoT a través del gateway MQTT↔HTTPS y Mosquitto: el backend llama al gateway por HTTPS (vía Traefik) y solo el gateway habla MQTT con Mosquitto.</w:t>
-      </w:r>
-    </w:p>
-    <w:p>
-      <w:pPr>
-        <w:pStyle w:val="BodyText"/>
-      </w:pPr>
-      <w:r>
-        <w:rPr>
-          <w:b/>
-          <w:bCs/>
-          <w:lang w:val="es-CO"/>
-        </w:rPr>
-        <w:t xml:space="preserve">[PENDIENTE: Diagrama 2 sin imagen fuente** en el repositorio ni en la v1.5 entregada. Revisión manual del líder: incluir la imagen o retirar la leyenda. El Diagrama 3 (mapa de AMB-09) ya muestra backend → Traefik → gateway (</w:t>
-      </w:r>
-      <w:r>
-        <w:rPr>
-          <w:rStyle w:val="VerbatimChar"/>
-          <w:b/>
-          <w:bCs/>
-          <w:lang w:val="es-CO"/>
-        </w:rPr>
-        <w:t xml:space="preserve">POST /v1/commands</w:t>
-      </w:r>
-      <w:r>
-        <w:rPr>
-          <w:b/>
-          <w:bCs/>
-          <w:lang w:val="es-CO"/>
-        </w:rPr>
-        <w:t xml:space="preserve">) y gateway → Mosquitto.**]</w:t>
-      </w:r>
-    </w:p>
-    <w:p>
-      <w:pPr>
         <w:pStyle w:val="Heading1"/>
       </w:pPr>
       <w:bookmarkStart w:id="65" w:name="_3288e55a6ae3be5b13146b498614a2519de8a37"/>
@@ -29118,74 +29074,150 @@
               <w:rPr>
                 <w:lang w:val="es-CO"/>
               </w:rPr>
-              <w:t xml:space="preserve">INC-BE-01</w:t>
-            </w:r>
-          </w:p>
-        </w:tc>
-        <w:tc>
-          <w:tcPr/>
-          <w:p>
-            <w:pPr>
-              <w:pStyle w:val="Compact"/>
-            </w:pPr>
-            <w:r>
-              <w:rPr>
-                <w:lang w:val="es-CO"/>
-              </w:rPr>
-              <w:t xml:space="preserve">El código de la Sandbox existe solo en la rama</w:t>
-            </w:r>
-            <w:r>
-              <w:rPr>
-                <w:lang w:val="es-CO"/>
-              </w:rPr>
-              <w:t xml:space="preserve"> </w:t>
-            </w:r>
-            <w:r>
-              <w:rPr>
-                <w:rStyle w:val="VerbatimChar"/>
-                <w:lang w:val="es-CO"/>
-              </w:rPr>
-              <w:t xml:space="preserve">test</w:t>
-            </w:r>
-            <w:r>
-              <w:rPr>
-                <w:lang w:val="es-CO"/>
-              </w:rPr>
-              <w:t xml:space="preserve"> </w:t>
-            </w:r>
-            <w:r>
-              <w:rPr>
-                <w:lang w:val="es-CO"/>
-              </w:rPr>
-              <w:t xml:space="preserve">del backend</w:t>
-            </w:r>
-          </w:p>
-        </w:tc>
-        <w:tc>
-          <w:tcPr/>
-          <w:p>
-            <w:pPr>
-              <w:pStyle w:val="Compact"/>
-            </w:pPr>
-            <w:r>
-              <w:rPr>
-                <w:lang w:val="es-CO"/>
-              </w:rPr>
-              <w:t xml:space="preserve">Desarrollo (informar a Pruebas)</w:t>
-            </w:r>
-          </w:p>
-        </w:tc>
-        <w:tc>
-          <w:tcPr/>
-          <w:p>
-            <w:pPr>
-              <w:pStyle w:val="Compact"/>
-            </w:pPr>
-            <w:r>
-              <w:rPr>
-                <w:lang w:val="es-CO"/>
-              </w:rPr>
-              <w:t xml:space="preserve">detectado — confirmar con Desarrollo</w:t>
+              <w:t xml:space="preserve">INC-FE-04</w:t>
+            </w:r>
+          </w:p>
+        </w:tc>
+        <w:tc>
+          <w:tcPr/>
+          <w:p>
+            <w:pPr>
+              <w:pStyle w:val="Compact"/>
+            </w:pPr>
+            <w:r>
+              <w:rPr>
+                <w:rStyle w:val="VerbatimChar"/>
+                <w:lang w:val="es-CO"/>
+              </w:rPr>
+              <w:t xml:space="preserve">sw.js</w:t>
+            </w:r>
+            <w:r>
+              <w:rPr>
+                <w:lang w:val="es-CO"/>
+              </w:rPr>
+              <w:t xml:space="preserve"> </w:t>
+            </w:r>
+            <w:r>
+              <w:rPr>
+                <w:lang w:val="es-CO"/>
+              </w:rPr>
+              <w:t xml:space="preserve">recibe dos</w:t>
+            </w:r>
+            <w:r>
+              <w:rPr>
+                <w:lang w:val="es-CO"/>
+              </w:rPr>
+              <w:t xml:space="preserve"> </w:t>
+            </w:r>
+            <w:r>
+              <w:rPr>
+                <w:rStyle w:val="VerbatimChar"/>
+                <w:lang w:val="es-CO"/>
+              </w:rPr>
+              <w:t xml:space="preserve">Cache-Control</w:t>
+            </w:r>
+            <w:r>
+              <w:rPr>
+                <w:lang w:val="es-CO"/>
+              </w:rPr>
+              <w:t xml:space="preserve"> </w:t>
+            </w:r>
+            <w:r>
+              <w:rPr>
+                <w:lang w:val="es-CO"/>
+              </w:rPr>
+              <w:t xml:space="preserve">(</w:t>
+            </w:r>
+            <w:r>
+              <w:rPr>
+                <w:rStyle w:val="VerbatimChar"/>
+                <w:lang w:val="es-CO"/>
+              </w:rPr>
+              <w:t xml:space="preserve">no-cache</w:t>
+            </w:r>
+            <w:r>
+              <w:rPr>
+                <w:lang w:val="es-CO"/>
+              </w:rPr>
+              <w:t xml:space="preserve"> </w:t>
+            </w:r>
+            <w:r>
+              <w:rPr>
+                <w:lang w:val="es-CO"/>
+              </w:rPr>
+              <w:t xml:space="preserve">del</w:t>
+            </w:r>
+            <w:r>
+              <w:rPr>
+                <w:lang w:val="es-CO"/>
+              </w:rPr>
+              <w:t xml:space="preserve"> </w:t>
+            </w:r>
+            <w:r>
+              <w:rPr>
+                <w:rStyle w:val="VerbatimChar"/>
+                <w:lang w:val="es-CO"/>
+              </w:rPr>
+              <w:t xml:space="preserve">map</w:t>
+            </w:r>
+            <w:r>
+              <w:rPr>
+                <w:lang w:val="es-CO"/>
+              </w:rPr>
+              <w:t xml:space="preserve"> </w:t>
+            </w:r>
+            <w:r>
+              <w:rPr>
+                <w:lang w:val="es-CO"/>
+              </w:rPr>
+              <w:t xml:space="preserve">y el de</w:t>
+            </w:r>
+            <w:r>
+              <w:rPr>
+                <w:lang w:val="es-CO"/>
+              </w:rPr>
+              <w:t xml:space="preserve"> </w:t>
+            </w:r>
+            <w:r>
+              <w:rPr>
+                <w:rStyle w:val="VerbatimChar"/>
+                <w:lang w:val="es-CO"/>
+              </w:rPr>
+              <w:t xml:space="preserve">expires 7d</w:t>
+            </w:r>
+            <w:r>
+              <w:rPr>
+                <w:lang w:val="es-CO"/>
+              </w:rPr>
+              <w:t xml:space="preserve">)</w:t>
+            </w:r>
+          </w:p>
+        </w:tc>
+        <w:tc>
+          <w:tcPr/>
+          <w:p>
+            <w:pPr>
+              <w:pStyle w:val="Compact"/>
+            </w:pPr>
+            <w:r>
+              <w:rPr>
+                <w:lang w:val="es-CO"/>
+              </w:rPr>
+              <w:t xml:space="preserve">Implementación</w:t>
+            </w:r>
+          </w:p>
+        </w:tc>
+        <w:tc>
+          <w:tcPr/>
+          <w:p>
+            <w:pPr>
+              <w:pStyle w:val="Compact"/>
+            </w:pPr>
+            <w:r>
+              <w:rPr>
+                <w:lang w:val="es-CO"/>
+              </w:rPr>
+              <w:t xml:space="preserve">detectado</w:t>
             </w:r>
           </w:p>
         </w:tc>
@@ -29201,124 +29233,74 @@
               <w:rPr>
                 <w:lang w:val="es-CO"/>
               </w:rPr>
-              <w:t xml:space="preserve">INC-BE-02</w:t>
-            </w:r>
-          </w:p>
-        </w:tc>
-        <w:tc>
-          <w:tcPr/>
-          <w:p>
-            <w:pPr>
-              <w:pStyle w:val="Compact"/>
-            </w:pPr>
-            <w:r>
-              <w:rPr>
-                <w:lang w:val="es-CO"/>
-              </w:rPr>
-              <w:t xml:space="preserve">El compose de TEST no reenvía</w:t>
-            </w:r>
-            <w:r>
-              <w:rPr>
-                <w:lang w:val="es-CO"/>
-              </w:rPr>
-              <w:t xml:space="preserve"> </w:t>
-            </w:r>
-            <w:r>
-              <w:rPr>
-                <w:rStyle w:val="VerbatimChar"/>
-                <w:lang w:val="es-CO"/>
-              </w:rPr>
-              <w:t xml:space="preserve">LOGOS_STORAGE_PATH</w:t>
-            </w:r>
-            <w:r>
-              <w:rPr>
-                <w:lang w:val="es-CO"/>
-              </w:rPr>
-              <w:t xml:space="preserve"> </w:t>
-            </w:r>
-            <w:r>
-              <w:rPr>
-                <w:lang w:val="es-CO"/>
-              </w:rPr>
-              <w:t xml:space="preserve">y</w:t>
-            </w:r>
-            <w:r>
-              <w:rPr>
-                <w:lang w:val="es-CO"/>
-              </w:rPr>
-              <w:t xml:space="preserve"> </w:t>
-            </w:r>
-            <w:r>
-              <w:rPr>
-                <w:rStyle w:val="VerbatimChar"/>
-                <w:lang w:val="es-CO"/>
-              </w:rPr>
-              <w:t xml:space="preserve">MODELOS_STORAGE_PATH</w:t>
-            </w:r>
-            <w:r>
-              <w:rPr>
-                <w:lang w:val="es-CO"/>
-              </w:rPr>
-              <w:t xml:space="preserve"> </w:t>
-            </w:r>
-            <w:r>
-              <w:rPr>
-                <w:lang w:val="es-CO"/>
-              </w:rPr>
-              <w:t xml:space="preserve">cae a</w:t>
-            </w:r>
-            <w:r>
-              <w:rPr>
-                <w:lang w:val="es-CO"/>
-              </w:rPr>
-              <w:t xml:space="preserve"> </w:t>
-            </w:r>
-            <w:r>
-              <w:rPr>
-                <w:rStyle w:val="VerbatimChar"/>
-                <w:lang w:val="es-CO"/>
-              </w:rPr>
-              <w:t xml:space="preserve">/tmp</w:t>
-            </w:r>
-            <w:r>
-              <w:rPr>
-                <w:lang w:val="es-CO"/>
-              </w:rPr>
-              <w:t xml:space="preserve"> </w:t>
-            </w:r>
-            <w:r>
-              <w:rPr>
-                <w:lang w:val="es-CO"/>
-              </w:rPr>
-              <w:t xml:space="preserve">sin volumen</w:t>
-            </w:r>
-          </w:p>
-        </w:tc>
-        <w:tc>
-          <w:tcPr/>
-          <w:p>
-            <w:pPr>
-              <w:pStyle w:val="Compact"/>
-            </w:pPr>
-            <w:r>
-              <w:rPr>
-                <w:lang w:val="es-CO"/>
-              </w:rPr>
-              <w:t xml:space="preserve">Implementación</w:t>
-            </w:r>
-          </w:p>
-        </w:tc>
-        <w:tc>
-          <w:tcPr/>
-          <w:p>
-            <w:pPr>
-              <w:pStyle w:val="Compact"/>
-            </w:pPr>
-            <w:r>
-              <w:rPr>
-                <w:lang w:val="es-CO"/>
-              </w:rPr>
-              <w:t xml:space="preserve">diagnosticado</w:t>
+              <w:t xml:space="preserve">INC-BE-01</w:t>
+            </w:r>
+          </w:p>
+        </w:tc>
+        <w:tc>
+          <w:tcPr/>
+          <w:p>
+            <w:pPr>
+              <w:pStyle w:val="Compact"/>
+            </w:pPr>
+            <w:r>
+              <w:rPr>
+                <w:lang w:val="es-CO"/>
+              </w:rPr>
+              <w:t xml:space="preserve">El código de la Sandbox existe solo en la rama</w:t>
+            </w:r>
+            <w:r>
+              <w:rPr>
+                <w:lang w:val="es-CO"/>
+              </w:rPr>
+              <w:t xml:space="preserve"> </w:t>
+            </w:r>
+            <w:r>
+              <w:rPr>
+                <w:rStyle w:val="VerbatimChar"/>
+                <w:lang w:val="es-CO"/>
+              </w:rPr>
+              <w:t xml:space="preserve">test</w:t>
+            </w:r>
+            <w:r>
+              <w:rPr>
+                <w:lang w:val="es-CO"/>
+              </w:rPr>
+              <w:t xml:space="preserve"> </w:t>
+            </w:r>
+            <w:r>
+              <w:rPr>
+                <w:lang w:val="es-CO"/>
+              </w:rPr>
+              <w:t xml:space="preserve">del backend</w:t>
+            </w:r>
+          </w:p>
+        </w:tc>
+        <w:tc>
+          <w:tcPr/>
+          <w:p>
+            <w:pPr>
+              <w:pStyle w:val="Compact"/>
+            </w:pPr>
+            <w:r>
+              <w:rPr>
+                <w:lang w:val="es-CO"/>
+              </w:rPr>
+              <w:t xml:space="preserve">Desarrollo (informar a Pruebas)</w:t>
+            </w:r>
+          </w:p>
+        </w:tc>
+        <w:tc>
+          <w:tcPr/>
+          <w:p>
+            <w:pPr>
+              <w:pStyle w:val="Compact"/>
+            </w:pPr>
+            <w:r>
+              <w:rPr>
+                <w:lang w:val="es-CO"/>
+              </w:rPr>
+              <w:t xml:space="preserve">detectado — confirmar con Desarrollo</w:t>
             </w:r>
           </w:p>
         </w:tc>
@@ -29334,75 +29316,124 @@
               <w:rPr>
                 <w:lang w:val="es-CO"/>
               </w:rPr>
-              <w:t xml:space="preserve">INC-BE-03</w:t>
-            </w:r>
-          </w:p>
-        </w:tc>
-        <w:tc>
-          <w:tcPr/>
-          <w:p>
-            <w:pPr>
-              <w:pStyle w:val="Compact"/>
-            </w:pPr>
-            <w:r>
-              <w:rPr>
-                <w:rStyle w:val="VerbatimChar"/>
-                <w:lang w:val="es-CO"/>
-              </w:rPr>
-              <w:t xml:space="preserve">ROOT_PATH</w:t>
-            </w:r>
-            <w:r>
-              <w:rPr>
-                <w:lang w:val="es-CO"/>
-              </w:rPr>
-              <w:t xml:space="preserve"> </w:t>
-            </w:r>
-            <w:r>
-              <w:rPr>
-                <w:lang w:val="es-CO"/>
-              </w:rPr>
-              <w:t xml:space="preserve">difiere del prefijo público; afecta los enlaces de</w:t>
-            </w:r>
-            <w:r>
-              <w:rPr>
-                <w:lang w:val="es-CO"/>
-              </w:rPr>
-              <w:t xml:space="preserve"> </w:t>
-            </w:r>
-            <w:r>
-              <w:rPr>
-                <w:rStyle w:val="VerbatimChar"/>
-                <w:lang w:val="es-CO"/>
-              </w:rPr>
-              <w:t xml:space="preserve">/docs</w:t>
-            </w:r>
-          </w:p>
-        </w:tc>
-        <w:tc>
-          <w:tcPr/>
-          <w:p>
-            <w:pPr>
-              <w:pStyle w:val="Compact"/>
-            </w:pPr>
-            <w:r>
-              <w:rPr>
-                <w:lang w:val="es-CO"/>
-              </w:rPr>
-              <w:t xml:space="preserve">Implementación (confirmar con Desarrollo)</w:t>
-            </w:r>
-          </w:p>
-        </w:tc>
-        <w:tc>
-          <w:tcPr/>
-          <w:p>
-            <w:pPr>
-              <w:pStyle w:val="Compact"/>
-            </w:pPr>
-            <w:r>
-              <w:rPr>
-                <w:lang w:val="es-CO"/>
-              </w:rPr>
-              <w:t xml:space="preserve">detectado — verificar</w:t>
+              <w:t xml:space="preserve">INC-BE-02</w:t>
+            </w:r>
+          </w:p>
+        </w:tc>
+        <w:tc>
+          <w:tcPr/>
+          <w:p>
+            <w:pPr>
+              <w:pStyle w:val="Compact"/>
+            </w:pPr>
+            <w:r>
+              <w:rPr>
+                <w:lang w:val="es-CO"/>
+              </w:rPr>
+              <w:t xml:space="preserve">El compose de TEST no reenvía</w:t>
+            </w:r>
+            <w:r>
+              <w:rPr>
+                <w:lang w:val="es-CO"/>
+              </w:rPr>
+              <w:t xml:space="preserve"> </w:t>
+            </w:r>
+            <w:r>
+              <w:rPr>
+                <w:rStyle w:val="VerbatimChar"/>
+                <w:lang w:val="es-CO"/>
+              </w:rPr>
+              <w:t xml:space="preserve">LOGOS_STORAGE_PATH</w:t>
+            </w:r>
+            <w:r>
+              <w:rPr>
+                <w:lang w:val="es-CO"/>
+              </w:rPr>
+              <w:t xml:space="preserve"> </w:t>
+            </w:r>
+            <w:r>
+              <w:rPr>
+                <w:lang w:val="es-CO"/>
+              </w:rPr>
+              <w:t xml:space="preserve">y</w:t>
+            </w:r>
+            <w:r>
+              <w:rPr>
+                <w:lang w:val="es-CO"/>
+              </w:rPr>
+              <w:t xml:space="preserve"> </w:t>
+            </w:r>
+            <w:r>
+              <w:rPr>
+                <w:rStyle w:val="VerbatimChar"/>
+                <w:lang w:val="es-CO"/>
+              </w:rPr>
+              <w:t xml:space="preserve">MODELOS_STORAGE_PATH</w:t>
+            </w:r>
+            <w:r>
+              <w:rPr>
+                <w:lang w:val="es-CO"/>
+              </w:rPr>
+              <w:t xml:space="preserve"> </w:t>
+            </w:r>
+            <w:r>
+              <w:rPr>
+                <w:lang w:val="es-CO"/>
+              </w:rPr>
+              <w:t xml:space="preserve">cae a</w:t>
+            </w:r>
+            <w:r>
+              <w:rPr>
+                <w:lang w:val="es-CO"/>
+              </w:rPr>
+              <w:t xml:space="preserve"> </w:t>
+            </w:r>
+            <w:r>
+              <w:rPr>
+                <w:rStyle w:val="VerbatimChar"/>
+                <w:lang w:val="es-CO"/>
+              </w:rPr>
+              <w:t xml:space="preserve">/tmp</w:t>
+            </w:r>
+            <w:r>
+              <w:rPr>
+                <w:lang w:val="es-CO"/>
+              </w:rPr>
+              <w:t xml:space="preserve"> </w:t>
+            </w:r>
+            <w:r>
+              <w:rPr>
+                <w:lang w:val="es-CO"/>
+              </w:rPr>
+              <w:t xml:space="preserve">sin volumen</w:t>
+            </w:r>
+          </w:p>
+        </w:tc>
+        <w:tc>
+          <w:tcPr/>
+          <w:p>
+            <w:pPr>
+              <w:pStyle w:val="Compact"/>
+            </w:pPr>
+            <w:r>
+              <w:rPr>
+                <w:lang w:val="es-CO"/>
+              </w:rPr>
+              <w:t xml:space="preserve">Implementación</w:t>
+            </w:r>
+          </w:p>
+        </w:tc>
+        <w:tc>
+          <w:tcPr/>
+          <w:p>
+            <w:pPr>
+              <w:pStyle w:val="Compact"/>
+            </w:pPr>
+            <w:r>
+              <w:rPr>
+                <w:lang w:val="es-CO"/>
+              </w:rPr>
+              <w:t xml:space="preserve">diagnosticado</w:t>
             </w:r>
           </w:p>
         </w:tc>
@@ -29418,62 +29449,75 @@
               <w:rPr>
                 <w:lang w:val="es-CO"/>
               </w:rPr>
-              <w:t xml:space="preserve">INC-BE-04</w:t>
-            </w:r>
-          </w:p>
-        </w:tc>
-        <w:tc>
-          <w:tcPr/>
-          <w:p>
-            <w:pPr>
-              <w:pStyle w:val="Compact"/>
-            </w:pPr>
-            <w:r>
-              <w:rPr>
-                <w:rStyle w:val="VerbatimChar"/>
-                <w:lang w:val="es-CO"/>
-              </w:rPr>
-              <w:t xml:space="preserve">.env.test.example</w:t>
-            </w:r>
-            <w:r>
-              <w:rPr>
-                <w:lang w:val="es-CO"/>
-              </w:rPr>
-              <w:t xml:space="preserve"> </w:t>
-            </w:r>
-            <w:r>
-              <w:rPr>
-                <w:lang w:val="es-CO"/>
-              </w:rPr>
-              <w:t xml:space="preserve">desalineada con el compose de TEST</w:t>
-            </w:r>
-          </w:p>
-        </w:tc>
-        <w:tc>
-          <w:tcPr/>
-          <w:p>
-            <w:pPr>
-              <w:pStyle w:val="Compact"/>
-            </w:pPr>
-            <w:r>
-              <w:rPr>
-                <w:lang w:val="es-CO"/>
-              </w:rPr>
-              <w:t xml:space="preserve">Implementación</w:t>
-            </w:r>
-          </w:p>
-        </w:tc>
-        <w:tc>
-          <w:tcPr/>
-          <w:p>
-            <w:pPr>
-              <w:pStyle w:val="Compact"/>
-            </w:pPr>
-            <w:r>
-              <w:rPr>
-                <w:lang w:val="es-CO"/>
-              </w:rPr>
-              <w:t xml:space="preserve">diagnosticado</w:t>
+              <w:t xml:space="preserve">INC-BE-03</w:t>
+            </w:r>
+          </w:p>
+        </w:tc>
+        <w:tc>
+          <w:tcPr/>
+          <w:p>
+            <w:pPr>
+              <w:pStyle w:val="Compact"/>
+            </w:pPr>
+            <w:r>
+              <w:rPr>
+                <w:rStyle w:val="VerbatimChar"/>
+                <w:lang w:val="es-CO"/>
+              </w:rPr>
+              <w:t xml:space="preserve">ROOT_PATH</w:t>
+            </w:r>
+            <w:r>
+              <w:rPr>
+                <w:lang w:val="es-CO"/>
+              </w:rPr>
+              <w:t xml:space="preserve"> </w:t>
+            </w:r>
+            <w:r>
+              <w:rPr>
+                <w:lang w:val="es-CO"/>
+              </w:rPr>
+              <w:t xml:space="preserve">difiere del prefijo público; afecta los enlaces de</w:t>
+            </w:r>
+            <w:r>
+              <w:rPr>
+                <w:lang w:val="es-CO"/>
+              </w:rPr>
+              <w:t xml:space="preserve"> </w:t>
+            </w:r>
+            <w:r>
+              <w:rPr>
+                <w:rStyle w:val="VerbatimChar"/>
+                <w:lang w:val="es-CO"/>
+              </w:rPr>
+              <w:t xml:space="preserve">/docs</w:t>
+            </w:r>
+          </w:p>
+        </w:tc>
+        <w:tc>
+          <w:tcPr/>
+          <w:p>
+            <w:pPr>
+              <w:pStyle w:val="Compact"/>
+            </w:pPr>
+            <w:r>
+              <w:rPr>
+                <w:lang w:val="es-CO"/>
+              </w:rPr>
+              <w:t xml:space="preserve">Implementación (confirmar con Desarrollo)</w:t>
+            </w:r>
+          </w:p>
+        </w:tc>
+        <w:tc>
+          <w:tcPr/>
+          <w:p>
+            <w:pPr>
+              <w:pStyle w:val="Compact"/>
+            </w:pPr>
+            <w:r>
+              <w:rPr>
+                <w:lang w:val="es-CO"/>
+              </w:rPr>
+              <w:t xml:space="preserve">detectado — verificar</w:t>
             </w:r>
           </w:p>
         </w:tc>
@@ -29489,59 +29533,34 @@
               <w:rPr>
                 <w:lang w:val="es-CO"/>
               </w:rPr>
-              <w:t xml:space="preserve">INC-BE-05</w:t>
-            </w:r>
-          </w:p>
-        </w:tc>
-        <w:tc>
-          <w:tcPr/>
-          <w:p>
-            <w:pPr>
-              <w:pStyle w:val="Compact"/>
-            </w:pPr>
-            <w:r>
-              <w:rPr>
-                <w:rStyle w:val="VerbatimChar"/>
-                <w:lang w:val="es-CO"/>
-              </w:rPr>
-              <w:t xml:space="preserve">AUDITORIA_M02_EVENTOS_POR_SEGUNDO</w:t>
-            </w:r>
-            <w:r>
-              <w:rPr>
-                <w:lang w:val="es-CO"/>
-              </w:rPr>
-              <w:t xml:space="preserve"> </w:t>
-            </w:r>
-            <w:r>
-              <w:rPr>
-                <w:lang w:val="es-CO"/>
-              </w:rPr>
-              <w:t xml:space="preserve">y</w:t>
-            </w:r>
-            <w:r>
-              <w:rPr>
-                <w:lang w:val="es-CO"/>
-              </w:rPr>
-              <w:t xml:space="preserve"> </w:t>
-            </w:r>
-            <w:r>
-              <w:rPr>
-                <w:rStyle w:val="VerbatimChar"/>
-                <w:lang w:val="es-CO"/>
-              </w:rPr>
-              <w:t xml:space="preserve">ALEMBIC_DATABASE_URL</w:t>
-            </w:r>
-            <w:r>
-              <w:rPr>
-                <w:lang w:val="es-CO"/>
-              </w:rPr>
-              <w:t xml:space="preserve"> </w:t>
-            </w:r>
-            <w:r>
-              <w:rPr>
-                <w:lang w:val="es-CO"/>
-              </w:rPr>
-              <w:t xml:space="preserve">faltan en el catálogo vivo</w:t>
+              <w:t xml:space="preserve">INC-BE-04</w:t>
+            </w:r>
+          </w:p>
+        </w:tc>
+        <w:tc>
+          <w:tcPr/>
+          <w:p>
+            <w:pPr>
+              <w:pStyle w:val="Compact"/>
+            </w:pPr>
+            <w:r>
+              <w:rPr>
+                <w:rStyle w:val="VerbatimChar"/>
+                <w:lang w:val="es-CO"/>
+              </w:rPr>
+              <w:t xml:space="preserve">.env.test.example</w:t>
+            </w:r>
+            <w:r>
+              <w:rPr>
+                <w:lang w:val="es-CO"/>
+              </w:rPr>
+              <w:t xml:space="preserve"> </w:t>
+            </w:r>
+            <w:r>
+              <w:rPr>
+                <w:lang w:val="es-CO"/>
+              </w:rPr>
+              <w:t xml:space="preserve">desalineada con el compose de TEST</w:t>
             </w:r>
           </w:p>
         </w:tc>
@@ -29585,62 +29604,100 @@
               <w:rPr>
                 <w:lang w:val="es-CO"/>
               </w:rPr>
-              <w:t xml:space="preserve">INC-BE-06</w:t>
-            </w:r>
-          </w:p>
-        </w:tc>
-        <w:tc>
-          <w:tcPr/>
-          <w:p>
-            <w:pPr>
-              <w:pStyle w:val="Compact"/>
-            </w:pPr>
-            <w:r>
-              <w:rPr>
-                <w:rStyle w:val="VerbatimChar"/>
-                <w:lang w:val="es-CO"/>
-              </w:rPr>
-              <w:t xml:space="preserve">AGROFUSION_SSO_PUBLIC_KEY_PATH</w:t>
-            </w:r>
-            <w:r>
-              <w:rPr>
-                <w:lang w:val="es-CO"/>
-              </w:rPr>
-              <w:t xml:space="preserve"> </w:t>
-            </w:r>
-            <w:r>
-              <w:rPr>
-                <w:lang w:val="es-CO"/>
-              </w:rPr>
-              <w:t xml:space="preserve">de DEV apunta a una ruta local no montada</w:t>
-            </w:r>
-          </w:p>
-        </w:tc>
-        <w:tc>
-          <w:tcPr/>
-          <w:p>
-            <w:pPr>
-              <w:pStyle w:val="Compact"/>
-            </w:pPr>
-            <w:r>
-              <w:rPr>
-                <w:lang w:val="es-CO"/>
-              </w:rPr>
-              <w:t xml:space="preserve">Desarrollo (valor: Despliegue)</w:t>
-            </w:r>
-          </w:p>
-        </w:tc>
-        <w:tc>
-          <w:tcPr/>
-          <w:p>
-            <w:pPr>
-              <w:pStyle w:val="Compact"/>
-            </w:pPr>
-            <w:r>
-              <w:rPr>
-                <w:lang w:val="es-CO"/>
-              </w:rPr>
-              <w:t xml:space="preserve">detectado — por confirmar</w:t>
+              <w:t xml:space="preserve">INC-BE-05</w:t>
+            </w:r>
+          </w:p>
+        </w:tc>
+        <w:tc>
+          <w:tcPr/>
+          <w:p>
+            <w:pPr>
+              <w:pStyle w:val="Compact"/>
+            </w:pPr>
+            <w:r>
+              <w:rPr>
+                <w:rStyle w:val="VerbatimChar"/>
+                <w:lang w:val="es-CO"/>
+              </w:rPr>
+              <w:t xml:space="preserve">AUDITORIA_M02_EVENTOS_POR_SEGUNDO</w:t>
+            </w:r>
+            <w:r>
+              <w:rPr>
+                <w:lang w:val="es-CO"/>
+              </w:rPr>
+              <w:t xml:space="preserve"> </w:t>
+            </w:r>
+            <w:r>
+              <w:rPr>
+                <w:lang w:val="es-CO"/>
+              </w:rPr>
+              <w:t xml:space="preserve">y</w:t>
+            </w:r>
+            <w:r>
+              <w:rPr>
+                <w:lang w:val="es-CO"/>
+              </w:rPr>
+              <w:t xml:space="preserve"> </w:t>
+            </w:r>
+            <w:r>
+              <w:rPr>
+                <w:rStyle w:val="VerbatimChar"/>
+                <w:lang w:val="es-CO"/>
+              </w:rPr>
+              <w:t xml:space="preserve">ALEMBIC_DATABASE_URL</w:t>
+            </w:r>
+            <w:r>
+              <w:rPr>
+                <w:lang w:val="es-CO"/>
+              </w:rPr>
+              <w:t xml:space="preserve"> </w:t>
+            </w:r>
+            <w:r>
+              <w:rPr>
+                <w:lang w:val="es-CO"/>
+              </w:rPr>
+              <w:t xml:space="preserve">faltaban en el catálogo vivo; agregadas a</w:t>
+            </w:r>
+            <w:r>
+              <w:rPr>
+                <w:lang w:val="es-CO"/>
+              </w:rPr>
+              <w:t xml:space="preserve"> </w:t>
+            </w:r>
+            <w:r>
+              <w:rPr>
+                <w:rStyle w:val="VerbatimChar"/>
+                <w:lang w:val="es-CO"/>
+              </w:rPr>
+              <w:t xml:space="preserve">registros/variables/VARIABLES-ENTORNO.md</w:t>
+            </w:r>
+          </w:p>
+        </w:tc>
+        <w:tc>
+          <w:tcPr/>
+          <w:p>
+            <w:pPr>
+              <w:pStyle w:val="Compact"/>
+            </w:pPr>
+            <w:r>
+              <w:rPr>
+                <w:lang w:val="es-CO"/>
+              </w:rPr>
+              <w:t xml:space="preserve">Implementación</w:t>
+            </w:r>
+          </w:p>
+        </w:tc>
+        <w:tc>
+          <w:tcPr/>
+          <w:p>
+            <w:pPr>
+              <w:pStyle w:val="Compact"/>
+            </w:pPr>
+            <w:r>
+              <w:rPr>
+                <w:lang w:val="es-CO"/>
+              </w:rPr>
+              <w:t xml:space="preserve">resuelto</w:t>
             </w:r>
           </w:p>
         </w:tc>
@@ -29656,99 +29713,62 @@
               <w:rPr>
                 <w:lang w:val="es-CO"/>
               </w:rPr>
-              <w:t xml:space="preserve">INC-BD-01</w:t>
-            </w:r>
-          </w:p>
-        </w:tc>
-        <w:tc>
-          <w:tcPr/>
-          <w:p>
-            <w:pPr>
-              <w:pStyle w:val="Compact"/>
-            </w:pPr>
-            <w:r>
-              <w:rPr>
-                <w:lang w:val="es-CO"/>
-              </w:rPr>
-              <w:t xml:space="preserve">Rol de conexión:</w:t>
-            </w:r>
-            <w:r>
-              <w:rPr>
-                <w:lang w:val="es-CO"/>
-              </w:rPr>
-              <w:t xml:space="preserve"> </w:t>
-            </w:r>
-            <w:r>
-              <w:rPr>
-                <w:rStyle w:val="VerbatimChar"/>
-                <w:lang w:val="es-CO"/>
-              </w:rPr>
-              <w:t xml:space="preserve">member_app</w:t>
-            </w:r>
-            <w:r>
-              <w:rPr>
-                <w:lang w:val="es-CO"/>
-              </w:rPr>
-              <w:t xml:space="preserve"> </w:t>
-            </w:r>
-            <w:r>
-              <w:rPr>
-                <w:lang w:val="es-CO"/>
-              </w:rPr>
-              <w:t xml:space="preserve">no existe; el gateway usa</w:t>
-            </w:r>
-            <w:r>
-              <w:rPr>
-                <w:lang w:val="es-CO"/>
-              </w:rPr>
-              <w:t xml:space="preserve"> </w:t>
-            </w:r>
-            <w:r>
-              <w:rPr>
-                <w:rStyle w:val="VerbatimChar"/>
-                <w:lang w:val="es-CO"/>
-              </w:rPr>
-              <w:t xml:space="preserve">dba</w:t>
-            </w:r>
-            <w:r>
-              <w:rPr>
-                <w:lang w:val="es-CO"/>
-              </w:rPr>
-              <w:t xml:space="preserve"> </w:t>
-            </w:r>
-            <w:r>
-              <w:rPr>
-                <w:lang w:val="es-CO"/>
-              </w:rPr>
-              <w:t xml:space="preserve">por host y puerto publicado</w:t>
-            </w:r>
-          </w:p>
-        </w:tc>
-        <w:tc>
-          <w:tcPr/>
-          <w:p>
-            <w:pPr>
-              <w:pStyle w:val="Compact"/>
-            </w:pPr>
-            <w:r>
-              <w:rPr>
-                <w:lang w:val="es-CO"/>
-              </w:rPr>
-              <w:t xml:space="preserve">DBA y AIoT</w:t>
-            </w:r>
-          </w:p>
-        </w:tc>
-        <w:tc>
-          <w:tcPr/>
-          <w:p>
-            <w:pPr>
-              <w:pStyle w:val="Compact"/>
-            </w:pPr>
-            <w:r>
-              <w:rPr>
-                <w:lang w:val="es-CO"/>
-              </w:rPr>
-              <w:t xml:space="preserve">diagnosticado</w:t>
+              <w:t xml:space="preserve">INC-BE-06</w:t>
+            </w:r>
+          </w:p>
+        </w:tc>
+        <w:tc>
+          <w:tcPr/>
+          <w:p>
+            <w:pPr>
+              <w:pStyle w:val="Compact"/>
+            </w:pPr>
+            <w:r>
+              <w:rPr>
+                <w:rStyle w:val="VerbatimChar"/>
+                <w:lang w:val="es-CO"/>
+              </w:rPr>
+              <w:t xml:space="preserve">AGROFUSION_SSO_PUBLIC_KEY_PATH</w:t>
+            </w:r>
+            <w:r>
+              <w:rPr>
+                <w:lang w:val="es-CO"/>
+              </w:rPr>
+              <w:t xml:space="preserve"> </w:t>
+            </w:r>
+            <w:r>
+              <w:rPr>
+                <w:lang w:val="es-CO"/>
+              </w:rPr>
+              <w:t xml:space="preserve">de DEV apunta a una ruta local no montada</w:t>
+            </w:r>
+          </w:p>
+        </w:tc>
+        <w:tc>
+          <w:tcPr/>
+          <w:p>
+            <w:pPr>
+              <w:pStyle w:val="Compact"/>
+            </w:pPr>
+            <w:r>
+              <w:rPr>
+                <w:lang w:val="es-CO"/>
+              </w:rPr>
+              <w:t xml:space="preserve">Desarrollo (valor: Despliegue)</w:t>
+            </w:r>
+          </w:p>
+        </w:tc>
+        <w:tc>
+          <w:tcPr/>
+          <w:p>
+            <w:pPr>
+              <w:pStyle w:val="Compact"/>
+            </w:pPr>
+            <w:r>
+              <w:rPr>
+                <w:lang w:val="es-CO"/>
+              </w:rPr>
+              <w:t xml:space="preserve">detectado — por confirmar</w:t>
             </w:r>
           </w:p>
         </w:tc>
@@ -29764,49 +29784,112 @@
               <w:rPr>
                 <w:lang w:val="es-CO"/>
               </w:rPr>
-              <w:t xml:space="preserve">INC-BD-02</w:t>
-            </w:r>
-          </w:p>
-        </w:tc>
-        <w:tc>
-          <w:tcPr/>
-          <w:p>
-            <w:pPr>
-              <w:pStyle w:val="Compact"/>
-            </w:pPr>
-            <w:r>
-              <w:rPr>
-                <w:lang w:val="es-CO"/>
-              </w:rPr>
-              <w:t xml:space="preserve">La BD de PROD publica 5449; depende de la restricción del firewall</w:t>
-            </w:r>
-          </w:p>
-        </w:tc>
-        <w:tc>
-          <w:tcPr/>
-          <w:p>
-            <w:pPr>
-              <w:pStyle w:val="Compact"/>
-            </w:pPr>
-            <w:r>
-              <w:rPr>
-                <w:lang w:val="es-CO"/>
-              </w:rPr>
-              <w:t xml:space="preserve">Despliegue (firewall) e Implementación (compose)</w:t>
-            </w:r>
-          </w:p>
-        </w:tc>
-        <w:tc>
-          <w:tcPr/>
-          <w:p>
-            <w:pPr>
-              <w:pStyle w:val="Compact"/>
-            </w:pPr>
-            <w:r>
-              <w:rPr>
-                <w:lang w:val="es-CO"/>
-              </w:rPr>
-              <w:t xml:space="preserve">diagnosticado</w:t>
+              <w:t xml:space="preserve">INC-BE-07</w:t>
+            </w:r>
+          </w:p>
+        </w:tc>
+        <w:tc>
+          <w:tcPr/>
+          <w:p>
+            <w:pPr>
+              <w:pStyle w:val="Compact"/>
+            </w:pPr>
+            <w:r>
+              <w:rPr>
+                <w:lang w:val="es-CO"/>
+              </w:rPr>
+              <w:t xml:space="preserve">El compose de PROD del backend no tiene guarda</w:t>
+            </w:r>
+            <w:r>
+              <w:rPr>
+                <w:lang w:val="es-CO"/>
+              </w:rPr>
+              <w:t xml:space="preserve"> </w:t>
+            </w:r>
+            <w:r>
+              <w:rPr>
+                <w:rStyle w:val="VerbatimChar"/>
+                <w:lang w:val="es-CO"/>
+              </w:rPr>
+              <w:t xml:space="preserve">:?</w:t>
+            </w:r>
+            <w:r>
+              <w:rPr>
+                <w:lang w:val="es-CO"/>
+              </w:rPr>
+              <w:t xml:space="preserve"> </w:t>
+            </w:r>
+            <w:r>
+              <w:rPr>
+                <w:lang w:val="es-CO"/>
+              </w:rPr>
+              <w:t xml:space="preserve">en</w:t>
+            </w:r>
+            <w:r>
+              <w:rPr>
+                <w:lang w:val="es-CO"/>
+              </w:rPr>
+              <w:t xml:space="preserve"> </w:t>
+            </w:r>
+            <w:r>
+              <w:rPr>
+                <w:rStyle w:val="VerbatimChar"/>
+                <w:lang w:val="es-CO"/>
+              </w:rPr>
+              <w:t xml:space="preserve">MQTT_BROKER_URL</w:t>
+            </w:r>
+            <w:r>
+              <w:rPr>
+                <w:lang w:val="es-CO"/>
+              </w:rPr>
+              <w:t xml:space="preserve"> </w:t>
+            </w:r>
+            <w:r>
+              <w:rPr>
+                <w:lang w:val="es-CO"/>
+              </w:rPr>
+              <w:t xml:space="preserve">ni en</w:t>
+            </w:r>
+            <w:r>
+              <w:rPr>
+                <w:lang w:val="es-CO"/>
+              </w:rPr>
+              <w:t xml:space="preserve"> </w:t>
+            </w:r>
+            <w:r>
+              <w:rPr>
+                <w:rStyle w:val="VerbatimChar"/>
+                <w:lang w:val="es-CO"/>
+              </w:rPr>
+              <w:t xml:space="preserve">MQTT_BROKER_TOKEN</w:t>
+            </w:r>
+          </w:p>
+        </w:tc>
+        <w:tc>
+          <w:tcPr/>
+          <w:p>
+            <w:pPr>
+              <w:pStyle w:val="Compact"/>
+            </w:pPr>
+            <w:r>
+              <w:rPr>
+                <w:lang w:val="es-CO"/>
+              </w:rPr>
+              <w:t xml:space="preserve">Implementación</w:t>
+            </w:r>
+          </w:p>
+        </w:tc>
+        <w:tc>
+          <w:tcPr/>
+          <w:p>
+            <w:pPr>
+              <w:pStyle w:val="Compact"/>
+            </w:pPr>
+            <w:r>
+              <w:rPr>
+                <w:lang w:val="es-CO"/>
+              </w:rPr>
+              <w:t xml:space="preserve">detectado</w:t>
             </w:r>
           </w:p>
         </w:tc>
@@ -29822,86 +29905,85 @@
               <w:rPr>
                 <w:lang w:val="es-CO"/>
               </w:rPr>
-              <w:t xml:space="preserve">INC-BD-03</w:t>
-            </w:r>
-          </w:p>
-        </w:tc>
-        <w:tc>
-          <w:tcPr/>
-          <w:p>
-            <w:pPr>
-              <w:pStyle w:val="Compact"/>
-            </w:pPr>
-            <w:r>
-              <w:rPr>
-                <w:rStyle w:val="VerbatimChar"/>
-                <w:lang w:val="es-CO"/>
-              </w:rPr>
-              <w:t xml:space="preserve">alembic upgrade head</w:t>
-            </w:r>
-            <w:r>
-              <w:rPr>
-                <w:lang w:val="es-CO"/>
-              </w:rPr>
-              <w:t xml:space="preserve"> </w:t>
-            </w:r>
-            <w:r>
-              <w:rPr>
-                <w:lang w:val="es-CO"/>
-              </w:rPr>
-              <w:t xml:space="preserve">falla en una base vacía con un</w:t>
-            </w:r>
-            <w:r>
-              <w:rPr>
-                <w:lang w:val="es-CO"/>
-              </w:rPr>
-              <w:t xml:space="preserve"> </w:t>
-            </w:r>
-            <w:r>
-              <w:rPr>
-                <w:rStyle w:val="VerbatimChar"/>
-                <w:lang w:val="es-CO"/>
-              </w:rPr>
-              <w:t xml:space="preserve">POSTGRES_USER</w:t>
-            </w:r>
-            <w:r>
-              <w:rPr>
-                <w:lang w:val="es-CO"/>
-              </w:rPr>
-              <w:t xml:space="preserve"> </w:t>
-            </w:r>
-            <w:r>
-              <w:rPr>
-                <w:lang w:val="es-CO"/>
-              </w:rPr>
-              <w:t xml:space="preserve">distinto de</w:t>
-            </w:r>
-            <w:r>
-              <w:rPr>
-                <w:lang w:val="es-CO"/>
-              </w:rPr>
-              <w:t xml:space="preserve"> </w:t>
-            </w:r>
-            <w:r>
-              <w:rPr>
-                <w:rStyle w:val="VerbatimChar"/>
-                <w:lang w:val="es-CO"/>
-              </w:rPr>
-              <w:t xml:space="preserve">postgres</w:t>
-            </w:r>
-          </w:p>
-        </w:tc>
-        <w:tc>
-          <w:tcPr/>
-          <w:p>
-            <w:pPr>
-              <w:pStyle w:val="Compact"/>
-            </w:pPr>
-            <w:r>
-              <w:rPr>
-                <w:lang w:val="es-CO"/>
-              </w:rPr>
-              <w:t xml:space="preserve">Desarrollo y DBA</w:t>
+              <w:t xml:space="preserve">INC-BD-01</w:t>
+            </w:r>
+          </w:p>
+        </w:tc>
+        <w:tc>
+          <w:tcPr/>
+          <w:p>
+            <w:pPr>
+              <w:pStyle w:val="Compact"/>
+            </w:pPr>
+            <w:r>
+              <w:rPr>
+                <w:lang w:val="es-CO"/>
+              </w:rPr>
+              <w:t xml:space="preserve">Rol de conexión:</w:t>
+            </w:r>
+            <w:r>
+              <w:rPr>
+                <w:lang w:val="es-CO"/>
+              </w:rPr>
+              <w:t xml:space="preserve"> </w:t>
+            </w:r>
+            <w:r>
+              <w:rPr>
+                <w:rStyle w:val="VerbatimChar"/>
+                <w:lang w:val="es-CO"/>
+              </w:rPr>
+              <w:t xml:space="preserve">member_app</w:t>
+            </w:r>
+            <w:r>
+              <w:rPr>
+                <w:lang w:val="es-CO"/>
+              </w:rPr>
+              <w:t xml:space="preserve"> </w:t>
+            </w:r>
+            <w:r>
+              <w:rPr>
+                <w:lang w:val="es-CO"/>
+              </w:rPr>
+              <w:t xml:space="preserve">no existe; el gateway usa</w:t>
+            </w:r>
+            <w:r>
+              <w:rPr>
+                <w:lang w:val="es-CO"/>
+              </w:rPr>
+              <w:t xml:space="preserve"> </w:t>
+            </w:r>
+            <w:r>
+              <w:rPr>
+                <w:rStyle w:val="VerbatimChar"/>
+                <w:lang w:val="es-CO"/>
+              </w:rPr>
+              <w:t xml:space="preserve">dba</w:t>
+            </w:r>
+            <w:r>
+              <w:rPr>
+                <w:lang w:val="es-CO"/>
+              </w:rPr>
+              <w:t xml:space="preserve"> </w:t>
+            </w:r>
+            <w:r>
+              <w:rPr>
+                <w:lang w:val="es-CO"/>
+              </w:rPr>
+              <w:t xml:space="preserve">por host y puerto publicado</w:t>
+            </w:r>
+          </w:p>
+        </w:tc>
+        <w:tc>
+          <w:tcPr/>
+          <w:p>
+            <w:pPr>
+              <w:pStyle w:val="Compact"/>
+            </w:pPr>
+            <w:r>
+              <w:rPr>
+                <w:lang w:val="es-CO"/>
+              </w:rPr>
+              <w:t xml:space="preserve">DBA y AIoT</w:t>
             </w:r>
           </w:p>
         </w:tc>
@@ -29931,62 +30013,49 @@
               <w:rPr>
                 <w:lang w:val="es-CO"/>
               </w:rPr>
-              <w:t xml:space="preserve">INC-BRK-01</w:t>
-            </w:r>
-          </w:p>
-        </w:tc>
-        <w:tc>
-          <w:tcPr/>
-          <w:p>
-            <w:pPr>
-              <w:pStyle w:val="Compact"/>
-            </w:pPr>
-            <w:r>
-              <w:rPr>
-                <w:lang w:val="es-CO"/>
-              </w:rPr>
-              <w:t xml:space="preserve">MQTT en texto plano publicado al host mientras Dokploy no fije</w:t>
-            </w:r>
-            <w:r>
-              <w:rPr>
-                <w:lang w:val="es-CO"/>
-              </w:rPr>
-              <w:t xml:space="preserve"> </w:t>
-            </w:r>
-            <w:r>
-              <w:rPr>
-                <w:rStyle w:val="VerbatimChar"/>
-                <w:lang w:val="es-CO"/>
-              </w:rPr>
-              <w:t xml:space="preserve">MQTT_PUERTO_PUBLICO=8883</w:t>
-            </w:r>
-          </w:p>
-        </w:tc>
-        <w:tc>
-          <w:tcPr/>
-          <w:p>
-            <w:pPr>
-              <w:pStyle w:val="Compact"/>
-            </w:pPr>
-            <w:r>
-              <w:rPr>
-                <w:lang w:val="es-CO"/>
-              </w:rPr>
-              <w:t xml:space="preserve">Despliegue + AIoT</w:t>
-            </w:r>
-          </w:p>
-        </w:tc>
-        <w:tc>
-          <w:tcPr/>
-          <w:p>
-            <w:pPr>
-              <w:pStyle w:val="Compact"/>
-            </w:pPr>
-            <w:r>
-              <w:rPr>
-                <w:lang w:val="es-CO"/>
-              </w:rPr>
-              <w:t xml:space="preserve">detectado</w:t>
+              <w:t xml:space="preserve">INC-BD-02</w:t>
+            </w:r>
+          </w:p>
+        </w:tc>
+        <w:tc>
+          <w:tcPr/>
+          <w:p>
+            <w:pPr>
+              <w:pStyle w:val="Compact"/>
+            </w:pPr>
+            <w:r>
+              <w:rPr>
+                <w:lang w:val="es-CO"/>
+              </w:rPr>
+              <w:t xml:space="preserve">La BD de PROD publica 5449; depende de la restricción del firewall</w:t>
+            </w:r>
+          </w:p>
+        </w:tc>
+        <w:tc>
+          <w:tcPr/>
+          <w:p>
+            <w:pPr>
+              <w:pStyle w:val="Compact"/>
+            </w:pPr>
+            <w:r>
+              <w:rPr>
+                <w:lang w:val="es-CO"/>
+              </w:rPr>
+              <w:t xml:space="preserve">Despliegue (firewall) e Implementación (compose)</w:t>
+            </w:r>
+          </w:p>
+        </w:tc>
+        <w:tc>
+          <w:tcPr/>
+          <w:p>
+            <w:pPr>
+              <w:pStyle w:val="Compact"/>
+            </w:pPr>
+            <w:r>
+              <w:rPr>
+                <w:lang w:val="es-CO"/>
+              </w:rPr>
+              <w:t xml:space="preserve">diagnosticado</w:t>
             </w:r>
           </w:p>
         </w:tc>
@@ -30002,49 +30071,100 @@
               <w:rPr>
                 <w:lang w:val="es-CO"/>
               </w:rPr>
-              <w:t xml:space="preserve">INC-BRK-02</w:t>
-            </w:r>
-          </w:p>
-        </w:tc>
-        <w:tc>
-          <w:tcPr/>
-          <w:p>
-            <w:pPr>
-              <w:pStyle w:val="Compact"/>
-            </w:pPr>
-            <w:r>
-              <w:rPr>
-                <w:lang w:val="es-CO"/>
-              </w:rPr>
-              <w:t xml:space="preserve">Sin confirmar qué compose y qué rama del broker alimentan TEST</w:t>
-            </w:r>
-          </w:p>
-        </w:tc>
-        <w:tc>
-          <w:tcPr/>
-          <w:p>
-            <w:pPr>
-              <w:pStyle w:val="Compact"/>
-            </w:pPr>
-            <w:r>
-              <w:rPr>
-                <w:lang w:val="es-CO"/>
-              </w:rPr>
-              <w:t xml:space="preserve">AIoT y Despliegue</w:t>
-            </w:r>
-          </w:p>
-        </w:tc>
-        <w:tc>
-          <w:tcPr/>
-          <w:p>
-            <w:pPr>
-              <w:pStyle w:val="Compact"/>
-            </w:pPr>
-            <w:r>
-              <w:rPr>
-                <w:lang w:val="es-CO"/>
-              </w:rPr>
-              <w:t xml:space="preserve">detectado — confirmar con AIoT</w:t>
+              <w:t xml:space="preserve">INC-BD-03</w:t>
+            </w:r>
+          </w:p>
+        </w:tc>
+        <w:tc>
+          <w:tcPr/>
+          <w:p>
+            <w:pPr>
+              <w:pStyle w:val="Compact"/>
+            </w:pPr>
+            <w:r>
+              <w:rPr>
+                <w:rStyle w:val="VerbatimChar"/>
+                <w:lang w:val="es-CO"/>
+              </w:rPr>
+              <w:t xml:space="preserve">alembic upgrade head</w:t>
+            </w:r>
+            <w:r>
+              <w:rPr>
+                <w:lang w:val="es-CO"/>
+              </w:rPr>
+              <w:t xml:space="preserve"> </w:t>
+            </w:r>
+            <w:r>
+              <w:rPr>
+                <w:lang w:val="es-CO"/>
+              </w:rPr>
+              <w:t xml:space="preserve">falla en una base vacía con un</w:t>
+            </w:r>
+            <w:r>
+              <w:rPr>
+                <w:lang w:val="es-CO"/>
+              </w:rPr>
+              <w:t xml:space="preserve"> </w:t>
+            </w:r>
+            <w:r>
+              <w:rPr>
+                <w:rStyle w:val="VerbatimChar"/>
+                <w:lang w:val="es-CO"/>
+              </w:rPr>
+              <w:t xml:space="preserve">POSTGRES_USER</w:t>
+            </w:r>
+            <w:r>
+              <w:rPr>
+                <w:lang w:val="es-CO"/>
+              </w:rPr>
+              <w:t xml:space="preserve"> </w:t>
+            </w:r>
+            <w:r>
+              <w:rPr>
+                <w:lang w:val="es-CO"/>
+              </w:rPr>
+              <w:t xml:space="preserve">distinto de</w:t>
+            </w:r>
+            <w:r>
+              <w:rPr>
+                <w:lang w:val="es-CO"/>
+              </w:rPr>
+              <w:t xml:space="preserve"> </w:t>
+            </w:r>
+            <w:r>
+              <w:rPr>
+                <w:rStyle w:val="VerbatimChar"/>
+                <w:lang w:val="es-CO"/>
+              </w:rPr>
+              <w:t xml:space="preserve">postgres</w:t>
+            </w:r>
+          </w:p>
+        </w:tc>
+        <w:tc>
+          <w:tcPr/>
+          <w:p>
+            <w:pPr>
+              <w:pStyle w:val="Compact"/>
+            </w:pPr>
+            <w:r>
+              <w:rPr>
+                <w:lang w:val="es-CO"/>
+              </w:rPr>
+              <w:t xml:space="preserve">Desarrollo y DBA</w:t>
+            </w:r>
+          </w:p>
+        </w:tc>
+        <w:tc>
+          <w:tcPr/>
+          <w:p>
+            <w:pPr>
+              <w:pStyle w:val="Compact"/>
+            </w:pPr>
+            <w:r>
+              <w:rPr>
+                <w:lang w:val="es-CO"/>
+              </w:rPr>
+              <w:t xml:space="preserve">diagnosticado</w:t>
             </w:r>
           </w:p>
         </w:tc>
@@ -30060,62 +30180,62 @@
               <w:rPr>
                 <w:lang w:val="es-CO"/>
               </w:rPr>
-              <w:t xml:space="preserve">INC-IMP-01</w:t>
-            </w:r>
-          </w:p>
-        </w:tc>
-        <w:tc>
-          <w:tcPr/>
-          <w:p>
-            <w:pPr>
-              <w:pStyle w:val="Compact"/>
-            </w:pPr>
-            <w:r>
-              <w:rPr>
-                <w:lang w:val="es-CO"/>
-              </w:rPr>
-              <w:t xml:space="preserve">El compose local de TEST montaba Mosquitto desde</w:t>
-            </w:r>
-            <w:r>
-              <w:rPr>
-                <w:lang w:val="es-CO"/>
-              </w:rPr>
-              <w:t xml:space="preserve"> </w:t>
-            </w:r>
-            <w:r>
-              <w:rPr>
-                <w:rStyle w:val="VerbatimChar"/>
-                <w:lang w:val="es-CO"/>
-              </w:rPr>
-              <w:t xml:space="preserve">BROKER-MQTT-SGPMP-develop</w:t>
-            </w:r>
-          </w:p>
-        </w:tc>
-        <w:tc>
-          <w:tcPr/>
-          <w:p>
-            <w:pPr>
-              <w:pStyle w:val="Compact"/>
-            </w:pPr>
-            <w:r>
-              <w:rPr>
-                <w:lang w:val="es-CO"/>
-              </w:rPr>
-              <w:t xml:space="preserve">Implementación</w:t>
-            </w:r>
-          </w:p>
-        </w:tc>
-        <w:tc>
-          <w:tcPr/>
-          <w:p>
-            <w:pPr>
-              <w:pStyle w:val="Compact"/>
-            </w:pPr>
-            <w:r>
-              <w:rPr>
-                <w:lang w:val="es-CO"/>
-              </w:rPr>
-              <w:t xml:space="preserve">resuelto</w:t>
+              <w:t xml:space="preserve">INC-BRK-01</w:t>
+            </w:r>
+          </w:p>
+        </w:tc>
+        <w:tc>
+          <w:tcPr/>
+          <w:p>
+            <w:pPr>
+              <w:pStyle w:val="Compact"/>
+            </w:pPr>
+            <w:r>
+              <w:rPr>
+                <w:lang w:val="es-CO"/>
+              </w:rPr>
+              <w:t xml:space="preserve">MQTT en texto plano publicado al host mientras Dokploy no fije</w:t>
+            </w:r>
+            <w:r>
+              <w:rPr>
+                <w:lang w:val="es-CO"/>
+              </w:rPr>
+              <w:t xml:space="preserve"> </w:t>
+            </w:r>
+            <w:r>
+              <w:rPr>
+                <w:rStyle w:val="VerbatimChar"/>
+                <w:lang w:val="es-CO"/>
+              </w:rPr>
+              <w:t xml:space="preserve">MQTT_PUERTO_PUBLICO=8883</w:t>
+            </w:r>
+          </w:p>
+        </w:tc>
+        <w:tc>
+          <w:tcPr/>
+          <w:p>
+            <w:pPr>
+              <w:pStyle w:val="Compact"/>
+            </w:pPr>
+            <w:r>
+              <w:rPr>
+                <w:lang w:val="es-CO"/>
+              </w:rPr>
+              <w:t xml:space="preserve">Despliegue + AIoT</w:t>
+            </w:r>
+          </w:p>
+        </w:tc>
+        <w:tc>
+          <w:tcPr/>
+          <w:p>
+            <w:pPr>
+              <w:pStyle w:val="Compact"/>
+            </w:pPr>
+            <w:r>
+              <w:rPr>
+                <w:lang w:val="es-CO"/>
+              </w:rPr>
+              <w:t xml:space="preserve">detectado</w:t>
             </w:r>
           </w:p>
         </w:tc>
@@ -30131,62 +30251,49 @@
               <w:rPr>
                 <w:lang w:val="es-CO"/>
               </w:rPr>
-              <w:t xml:space="preserve">INC-IMP-02</w:t>
-            </w:r>
-          </w:p>
-        </w:tc>
-        <w:tc>
-          <w:tcPr/>
-          <w:p>
-            <w:pPr>
-              <w:pStyle w:val="Compact"/>
-            </w:pPr>
-            <w:r>
-              <w:rPr>
-                <w:lang w:val="es-CO"/>
-              </w:rPr>
-              <w:t xml:space="preserve">Restauración de la BD validada en una rama divergente, sin integrar a</w:t>
-            </w:r>
-            <w:r>
-              <w:rPr>
-                <w:lang w:val="es-CO"/>
-              </w:rPr>
-              <w:t xml:space="preserve"> </w:t>
-            </w:r>
-            <w:r>
-              <w:rPr>
-                <w:rStyle w:val="VerbatimChar"/>
-                <w:lang w:val="es-CO"/>
-              </w:rPr>
-              <w:t xml:space="preserve">main</w:t>
-            </w:r>
-          </w:p>
-        </w:tc>
-        <w:tc>
-          <w:tcPr/>
-          <w:p>
-            <w:pPr>
-              <w:pStyle w:val="Compact"/>
-            </w:pPr>
-            <w:r>
-              <w:rPr>
-                <w:lang w:val="es-CO"/>
-              </w:rPr>
-              <w:t xml:space="preserve">Implementación</w:t>
-            </w:r>
-          </w:p>
-        </w:tc>
-        <w:tc>
-          <w:tcPr/>
-          <w:p>
-            <w:pPr>
-              <w:pStyle w:val="Compact"/>
-            </w:pPr>
-            <w:r>
-              <w:rPr>
-                <w:lang w:val="es-CO"/>
-              </w:rPr>
-              <w:t xml:space="preserve">detectado — por confirmar</w:t>
+              <w:t xml:space="preserve">INC-BRK-02</w:t>
+            </w:r>
+          </w:p>
+        </w:tc>
+        <w:tc>
+          <w:tcPr/>
+          <w:p>
+            <w:pPr>
+              <w:pStyle w:val="Compact"/>
+            </w:pPr>
+            <w:r>
+              <w:rPr>
+                <w:lang w:val="es-CO"/>
+              </w:rPr>
+              <w:t xml:space="preserve">Sin confirmar qué compose y qué rama del broker alimentan TEST</w:t>
+            </w:r>
+          </w:p>
+        </w:tc>
+        <w:tc>
+          <w:tcPr/>
+          <w:p>
+            <w:pPr>
+              <w:pStyle w:val="Compact"/>
+            </w:pPr>
+            <w:r>
+              <w:rPr>
+                <w:lang w:val="es-CO"/>
+              </w:rPr>
+              <w:t xml:space="preserve">AIoT y Despliegue</w:t>
+            </w:r>
+          </w:p>
+        </w:tc>
+        <w:tc>
+          <w:tcPr/>
+          <w:p>
+            <w:pPr>
+              <w:pStyle w:val="Compact"/>
+            </w:pPr>
+            <w:r>
+              <w:rPr>
+                <w:lang w:val="es-CO"/>
+              </w:rPr>
+              <w:t xml:space="preserve">detectado — confirmar con AIoT</w:t>
             </w:r>
           </w:p>
         </w:tc>
@@ -30202,49 +30309,62 @@
               <w:rPr>
                 <w:lang w:val="es-CO"/>
               </w:rPr>
-              <w:t xml:space="preserve">INC-IMP-03</w:t>
-            </w:r>
-          </w:p>
-        </w:tc>
-        <w:tc>
-          <w:tcPr/>
-          <w:p>
-            <w:pPr>
-              <w:pStyle w:val="Compact"/>
-            </w:pPr>
-            <w:r>
-              <w:rPr>
-                <w:lang w:val="es-CO"/>
-              </w:rPr>
-              <w:t xml:space="preserve">Ningún repositorio publica imágenes; Dokploy construye en cada despliegue</w:t>
-            </w:r>
-          </w:p>
-        </w:tc>
-        <w:tc>
-          <w:tcPr/>
-          <w:p>
-            <w:pPr>
-              <w:pStyle w:val="Compact"/>
-            </w:pPr>
-            <w:r>
-              <w:rPr>
-                <w:lang w:val="es-CO"/>
-              </w:rPr>
-              <w:t xml:space="preserve">Implementación y Desarrollo</w:t>
-            </w:r>
-          </w:p>
-        </w:tc>
-        <w:tc>
-          <w:tcPr/>
-          <w:p>
-            <w:pPr>
-              <w:pStyle w:val="Compact"/>
-            </w:pPr>
-            <w:r>
-              <w:rPr>
-                <w:lang w:val="es-CO"/>
-              </w:rPr>
-              <w:t xml:space="preserve">diagnosticado</w:t>
+              <w:t xml:space="preserve">INC-IMP-01</w:t>
+            </w:r>
+          </w:p>
+        </w:tc>
+        <w:tc>
+          <w:tcPr/>
+          <w:p>
+            <w:pPr>
+              <w:pStyle w:val="Compact"/>
+            </w:pPr>
+            <w:r>
+              <w:rPr>
+                <w:lang w:val="es-CO"/>
+              </w:rPr>
+              <w:t xml:space="preserve">El compose local de TEST montaba Mosquitto desde</w:t>
+            </w:r>
+            <w:r>
+              <w:rPr>
+                <w:lang w:val="es-CO"/>
+              </w:rPr>
+              <w:t xml:space="preserve"> </w:t>
+            </w:r>
+            <w:r>
+              <w:rPr>
+                <w:rStyle w:val="VerbatimChar"/>
+                <w:lang w:val="es-CO"/>
+              </w:rPr>
+              <w:t xml:space="preserve">BROKER-MQTT-SGPMP-develop</w:t>
+            </w:r>
+          </w:p>
+        </w:tc>
+        <w:tc>
+          <w:tcPr/>
+          <w:p>
+            <w:pPr>
+              <w:pStyle w:val="Compact"/>
+            </w:pPr>
+            <w:r>
+              <w:rPr>
+                <w:lang w:val="es-CO"/>
+              </w:rPr>
+              <w:t xml:space="preserve">Implementación</w:t>
+            </w:r>
+          </w:p>
+        </w:tc>
+        <w:tc>
+          <w:tcPr/>
+          <w:p>
+            <w:pPr>
+              <w:pStyle w:val="Compact"/>
+            </w:pPr>
+            <w:r>
+              <w:rPr>
+                <w:lang w:val="es-CO"/>
+              </w:rPr>
+              <w:t xml:space="preserve">resuelto</w:t>
             </w:r>
           </w:p>
         </w:tc>
@@ -30260,6 +30380,135 @@
               <w:rPr>
                 <w:lang w:val="es-CO"/>
               </w:rPr>
+              <w:t xml:space="preserve">INC-IMP-02</w:t>
+            </w:r>
+          </w:p>
+        </w:tc>
+        <w:tc>
+          <w:tcPr/>
+          <w:p>
+            <w:pPr>
+              <w:pStyle w:val="Compact"/>
+            </w:pPr>
+            <w:r>
+              <w:rPr>
+                <w:lang w:val="es-CO"/>
+              </w:rPr>
+              <w:t xml:space="preserve">Restauración de la BD validada en una rama divergente, sin integrar a</w:t>
+            </w:r>
+            <w:r>
+              <w:rPr>
+                <w:lang w:val="es-CO"/>
+              </w:rPr>
+              <w:t xml:space="preserve"> </w:t>
+            </w:r>
+            <w:r>
+              <w:rPr>
+                <w:rStyle w:val="VerbatimChar"/>
+                <w:lang w:val="es-CO"/>
+              </w:rPr>
+              <w:t xml:space="preserve">main</w:t>
+            </w:r>
+          </w:p>
+        </w:tc>
+        <w:tc>
+          <w:tcPr/>
+          <w:p>
+            <w:pPr>
+              <w:pStyle w:val="Compact"/>
+            </w:pPr>
+            <w:r>
+              <w:rPr>
+                <w:lang w:val="es-CO"/>
+              </w:rPr>
+              <w:t xml:space="preserve">Implementación</w:t>
+            </w:r>
+          </w:p>
+        </w:tc>
+        <w:tc>
+          <w:tcPr/>
+          <w:p>
+            <w:pPr>
+              <w:pStyle w:val="Compact"/>
+            </w:pPr>
+            <w:r>
+              <w:rPr>
+                <w:lang w:val="es-CO"/>
+              </w:rPr>
+              <w:t xml:space="preserve">detectado — por confirmar</w:t>
+            </w:r>
+          </w:p>
+        </w:tc>
+      </w:tr>
+      <w:tr>
+        <w:tc>
+          <w:tcPr/>
+          <w:p>
+            <w:pPr>
+              <w:pStyle w:val="Compact"/>
+            </w:pPr>
+            <w:r>
+              <w:rPr>
+                <w:lang w:val="es-CO"/>
+              </w:rPr>
+              <w:t xml:space="preserve">INC-IMP-03</w:t>
+            </w:r>
+          </w:p>
+        </w:tc>
+        <w:tc>
+          <w:tcPr/>
+          <w:p>
+            <w:pPr>
+              <w:pStyle w:val="Compact"/>
+            </w:pPr>
+            <w:r>
+              <w:rPr>
+                <w:lang w:val="es-CO"/>
+              </w:rPr>
+              <w:t xml:space="preserve">Ningún repositorio publica imágenes; Dokploy construye en cada despliegue</w:t>
+            </w:r>
+          </w:p>
+        </w:tc>
+        <w:tc>
+          <w:tcPr/>
+          <w:p>
+            <w:pPr>
+              <w:pStyle w:val="Compact"/>
+            </w:pPr>
+            <w:r>
+              <w:rPr>
+                <w:lang w:val="es-CO"/>
+              </w:rPr>
+              <w:t xml:space="preserve">Implementación y Desarrollo</w:t>
+            </w:r>
+          </w:p>
+        </w:tc>
+        <w:tc>
+          <w:tcPr/>
+          <w:p>
+            <w:pPr>
+              <w:pStyle w:val="Compact"/>
+            </w:pPr>
+            <w:r>
+              <w:rPr>
+                <w:lang w:val="es-CO"/>
+              </w:rPr>
+              <w:t xml:space="preserve">diagnosticado</w:t>
+            </w:r>
+          </w:p>
+        </w:tc>
+      </w:tr>
+      <w:tr>
+        <w:tc>
+          <w:tcPr/>
+          <w:p>
+            <w:pPr>
+              <w:pStyle w:val="Compact"/>
+            </w:pPr>
+            <w:r>
+              <w:rPr>
+                <w:lang w:val="es-CO"/>
+              </w:rPr>
               <w:t xml:space="preserve">INC-IMP-04</w:t>
             </w:r>
           </w:p>
@@ -30303,6 +30552,102 @@
                 <w:lang w:val="es-CO"/>
               </w:rPr>
               <w:t xml:space="preserve">diagnosticado — rotación pendiente</w:t>
+            </w:r>
+          </w:p>
+        </w:tc>
+      </w:tr>
+      <w:tr>
+        <w:tc>
+          <w:tcPr/>
+          <w:p>
+            <w:pPr>
+              <w:pStyle w:val="Compact"/>
+            </w:pPr>
+            <w:r>
+              <w:rPr>
+                <w:lang w:val="es-CO"/>
+              </w:rPr>
+              <w:t xml:space="preserve">INC-IMP-05</w:t>
+            </w:r>
+          </w:p>
+        </w:tc>
+        <w:tc>
+          <w:tcPr/>
+          <w:p>
+            <w:pPr>
+              <w:pStyle w:val="Compact"/>
+            </w:pPr>
+            <w:r>
+              <w:rPr>
+                <w:rStyle w:val="VerbatimChar"/>
+                <w:lang w:val="es-CO"/>
+              </w:rPr>
+              <w:t xml:space="preserve">compose/</w:t>
+            </w:r>
+            <w:r>
+              <w:rPr>
+                <w:lang w:val="es-CO"/>
+              </w:rPr>
+              <w:t xml:space="preserve"> </w:t>
+            </w:r>
+            <w:r>
+              <w:rPr>
+                <w:lang w:val="es-CO"/>
+              </w:rPr>
+              <w:t xml:space="preserve">de SGMP-Integracion todavía pasa</w:t>
+            </w:r>
+            <w:r>
+              <w:rPr>
+                <w:lang w:val="es-CO"/>
+              </w:rPr>
+              <w:t xml:space="preserve"> </w:t>
+            </w:r>
+            <w:r>
+              <w:rPr>
+                <w:rStyle w:val="VerbatimChar"/>
+                <w:lang w:val="es-CO"/>
+              </w:rPr>
+              <w:t xml:space="preserve">API_TOKEN</w:t>
+            </w:r>
+            <w:r>
+              <w:rPr>
+                <w:lang w:val="es-CO"/>
+              </w:rPr>
+              <w:t xml:space="preserve"> </w:t>
+            </w:r>
+            <w:r>
+              <w:rPr>
+                <w:lang w:val="es-CO"/>
+              </w:rPr>
+              <w:t xml:space="preserve">al gateway, que ya no lo lee</w:t>
+            </w:r>
+          </w:p>
+        </w:tc>
+        <w:tc>
+          <w:tcPr/>
+          <w:p>
+            <w:pPr>
+              <w:pStyle w:val="Compact"/>
+            </w:pPr>
+            <w:r>
+              <w:rPr>
+                <w:lang w:val="es-CO"/>
+              </w:rPr>
+              <w:t xml:space="preserve">Implementación</w:t>
+            </w:r>
+          </w:p>
+        </w:tc>
+        <w:tc>
+          <w:tcPr/>
+          <w:p>
+            <w:pPr>
+              <w:pStyle w:val="Compact"/>
+            </w:pPr>
+            <w:r>
+              <w:rPr>
+                <w:lang w:val="es-CO"/>
+              </w:rPr>
+              <w:t xml:space="preserve">detectado</w:t>
             </w:r>
           </w:p>
         </w:tc>
@@ -34443,6 +34788,75 @@
                 <w:lang w:val="es-CO"/>
               </w:rPr>
               <w:t xml:space="preserve">REV-02 N-08, N-15, N-20; CA-5</w:t>
+            </w:r>
+          </w:p>
+        </w:tc>
+      </w:tr>
+      <w:tr>
+        <w:tc>
+          <w:tcPr/>
+          <w:p>
+            <w:pPr>
+              <w:pStyle w:val="Compact"/>
+            </w:pPr>
+            <w:r>
+              <w:rPr>
+                <w:lang w:val="es-CO"/>
+              </w:rPr>
+              <w:t xml:space="preserve">Portada, 3.3, 3.4, 3.8, 8, 11.4</w:t>
+            </w:r>
+          </w:p>
+        </w:tc>
+        <w:tc>
+          <w:tcPr/>
+          <w:p>
+            <w:pPr>
+              <w:pStyle w:val="Compact"/>
+            </w:pPr>
+            <w:r>
+              <w:rPr>
+                <w:lang w:val="es-CO"/>
+              </w:rPr>
+              <w:t xml:space="preserve">Institución en la portada; se retiran las leyendas de los diagramas sin imagen fuente y el mapa de AMB-09 pasa a ser el Diagrama 1;</w:t>
+            </w:r>
+            <w:r>
+              <w:rPr>
+                <w:lang w:val="es-CO"/>
+              </w:rPr>
+              <w:t xml:space="preserve"> </w:t>
+            </w:r>
+            <w:r>
+              <w:rPr>
+                <w:rStyle w:val="VerbatimChar"/>
+                <w:lang w:val="es-CO"/>
+              </w:rPr>
+              <w:t xml:space="preserve">VITE_FIREBASE_API_KEY</w:t>
+            </w:r>
+            <w:r>
+              <w:rPr>
+                <w:lang w:val="es-CO"/>
+              </w:rPr>
+              <w:t xml:space="preserve"> </w:t>
+            </w:r>
+            <w:r>
+              <w:rPr>
+                <w:lang w:val="es-CO"/>
+              </w:rPr>
+              <w:t xml:space="preserve">de TEST como valor propio de TEST; INC-FE-04, INC-BE-07 e INC-IMP-05 nuevas; INC-BE-05 resuelta en el catálogo vivo.</w:t>
+            </w:r>
+          </w:p>
+        </w:tc>
+        <w:tc>
+          <w:tcPr/>
+          <w:p>
+            <w:pPr>
+              <w:pStyle w:val="Compact"/>
+            </w:pPr>
+            <w:r>
+              <w:rPr>
+                <w:lang w:val="es-CO"/>
+              </w:rPr>
+              <w:t xml:space="preserve">Indicaciones del líder sobre la corrección de REV-02</w:t>
             </w:r>
           </w:p>
         </w:tc>

</xml_diff>